<commit_message>
docs: cap nhat huong dan theo mat khau lan dau Okr@2026
Co-Authored-By: Claude Opus 5 <noreply@anthropic.com>
</commit_message>
<xml_diff>
--- a/docs/HUONG_DAN_SU_DUNG_OKR.docx
+++ b/docs/HUONG_DAN_SU_DUNG_OKR.docx
@@ -1518,7 +1518,7 @@
           <w:sz w:val="22"/>
           <w:szCs w:val="22"/>
         </w:rPr>
-        <w:t xml:space="preserve">Quản trị viên sẽ gửi riêng cho thầy/cô </w:t>
+        <w:t xml:space="preserve">Quản trị viên sẽ gửi cho thầy/cô </w:t>
       </w:r>
       <w:r>
         <w:rPr>
@@ -1536,25 +1536,43 @@
           <w:sz w:val="22"/>
           <w:szCs w:val="22"/>
         </w:rPr>
-        <w:t xml:space="preserve"> và </w:t>
-      </w:r>
-      <w:r>
-        <w:rPr>
-          <w:rFonts w:ascii="Times New Roman" w:cs="Times New Roman" w:eastAsia="Times New Roman" w:hAnsi="Times New Roman"/>
-          <w:b/>
-          <w:bCs/>
-          <w:sz w:val="22"/>
-          <w:szCs w:val="22"/>
-        </w:rPr>
-        <w:t xml:space="preserve">mật khẩu lần đầu</w:t>
-      </w:r>
-      <w:r>
-        <w:rPr>
-          <w:rFonts w:ascii="Times New Roman" w:cs="Times New Roman" w:eastAsia="Times New Roman" w:hAnsi="Times New Roman"/>
-          <w:sz w:val="22"/>
-          <w:szCs w:val="22"/>
-        </w:rPr>
-        <w:t xml:space="preserve">. Mật khẩu này là chuỗi ngẫu nhiên, chỉ dùng cho lần đăng nhập đầu tiên.</w:t>
+        <w:t xml:space="preserve">. </w:t>
+      </w:r>
+      <w:r>
+        <w:rPr>
+          <w:rFonts w:ascii="Times New Roman" w:cs="Times New Roman" w:eastAsia="Times New Roman" w:hAnsi="Times New Roman"/>
+          <w:b/>
+          <w:bCs/>
+          <w:sz w:val="22"/>
+          <w:szCs w:val="22"/>
+        </w:rPr>
+        <w:t xml:space="preserve">Mật khẩu lần đầu</w:t>
+      </w:r>
+      <w:r>
+        <w:rPr>
+          <w:rFonts w:ascii="Times New Roman" w:cs="Times New Roman" w:eastAsia="Times New Roman" w:hAnsi="Times New Roman"/>
+          <w:sz w:val="22"/>
+          <w:szCs w:val="22"/>
+        </w:rPr>
+        <w:t xml:space="preserve"> của mọi tài khoản mới là </w:t>
+      </w:r>
+      <w:r>
+        <w:rPr>
+          <w:rFonts w:ascii="Times New Roman" w:cs="Times New Roman" w:eastAsia="Times New Roman" w:hAnsi="Times New Roman"/>
+          <w:b/>
+          <w:bCs/>
+          <w:sz w:val="22"/>
+          <w:szCs w:val="22"/>
+        </w:rPr>
+        <w:t xml:space="preserve">Okr@2026</w:t>
+      </w:r>
+      <w:r>
+        <w:rPr>
+          <w:rFonts w:ascii="Times New Roman" w:cs="Times New Roman" w:eastAsia="Times New Roman" w:hAnsi="Times New Roman"/>
+          <w:sz w:val="22"/>
+          <w:szCs w:val="22"/>
+        </w:rPr>
+        <w:t xml:space="preserve"> (chữ O viết hoa). Mật khẩu này chỉ dùng cho lần đăng nhập đầu tiên.</w:t>
       </w:r>
     </w:p>
     <w:p>
@@ -1670,25 +1688,25 @@
           <w:sz w:val="22"/>
           <w:szCs w:val="22"/>
         </w:rPr>
-        <w:t xml:space="preserve"> và </w:t>
-      </w:r>
-      <w:r>
-        <w:rPr>
-          <w:rFonts w:ascii="Times New Roman" w:cs="Times New Roman" w:eastAsia="Times New Roman" w:hAnsi="Times New Roman"/>
-          <w:b/>
-          <w:bCs/>
-          <w:sz w:val="22"/>
-          <w:szCs w:val="22"/>
-        </w:rPr>
-        <w:t xml:space="preserve">Mật khẩu</w:t>
-      </w:r>
-      <w:r>
-        <w:rPr>
-          <w:rFonts w:ascii="Times New Roman" w:cs="Times New Roman" w:eastAsia="Times New Roman" w:hAnsi="Times New Roman"/>
-          <w:sz w:val="22"/>
-          <w:szCs w:val="22"/>
-        </w:rPr>
-        <w:t xml:space="preserve"> đã được cấp, gõ đúng chữ hoa, chữ thường</w:t>
+        <w:t xml:space="preserve"> và mật khẩu </w:t>
+      </w:r>
+      <w:r>
+        <w:rPr>
+          <w:rFonts w:ascii="Times New Roman" w:cs="Times New Roman" w:eastAsia="Times New Roman" w:hAnsi="Times New Roman"/>
+          <w:b/>
+          <w:bCs/>
+          <w:sz w:val="22"/>
+          <w:szCs w:val="22"/>
+        </w:rPr>
+        <w:t xml:space="preserve">Okr@2026</w:t>
+      </w:r>
+      <w:r>
+        <w:rPr>
+          <w:rFonts w:ascii="Times New Roman" w:cs="Times New Roman" w:eastAsia="Times New Roman" w:hAnsi="Times New Roman"/>
+          <w:sz w:val="22"/>
+          <w:szCs w:val="22"/>
+        </w:rPr>
+        <w:t xml:space="preserve">, gõ đúng chữ hoa, chữ thường</w:t>
       </w:r>
     </w:p>
     <w:p>
@@ -1807,7 +1825,17 @@
           <w:sz w:val="22"/>
           <w:szCs w:val="22"/>
         </w:rPr>
-        <w:t xml:space="preserve"> (mật khẩu vừa được cấp)</w:t>
+        <w:t xml:space="preserve">: </w:t>
+      </w:r>
+      <w:r>
+        <w:rPr>
+          <w:rFonts w:ascii="Times New Roman" w:cs="Times New Roman" w:eastAsia="Times New Roman" w:hAnsi="Times New Roman"/>
+          <w:b/>
+          <w:bCs/>
+          <w:sz w:val="22"/>
+          <w:szCs w:val="22"/>
+        </w:rPr>
+        <w:t xml:space="preserve">Okr@2026</w:t>
       </w:r>
     </w:p>
     <w:p>
@@ -2736,25 +2764,7 @@
           <w:sz w:val="22"/>
           <w:szCs w:val="22"/>
         </w:rPr>
-        <w:t xml:space="preserve">Hệ thống báo số học sinh đã nhập và </w:t>
-      </w:r>
-      <w:r>
-        <w:rPr>
-          <w:rFonts w:ascii="Times New Roman" w:cs="Times New Roman" w:eastAsia="Times New Roman" w:hAnsi="Times New Roman"/>
-          <w:b/>
-          <w:bCs/>
-          <w:sz w:val="22"/>
-          <w:szCs w:val="22"/>
-        </w:rPr>
-        <w:t xml:space="preserve">tự tải về một file danh sách mật khẩu</w:t>
-      </w:r>
-      <w:r>
-        <w:rPr>
-          <w:rFonts w:ascii="Times New Roman" w:cs="Times New Roman" w:eastAsia="Times New Roman" w:hAnsi="Times New Roman"/>
-          <w:sz w:val="22"/>
-          <w:szCs w:val="22"/>
-        </w:rPr>
-        <w:t xml:space="preserve"> (dạng .csv, mở bằng Excel)</w:t>
+        <w:t xml:space="preserve">Hệ thống báo số học sinh đã nhập thành công</w:t>
       </w:r>
     </w:p>
     <w:p>
@@ -2772,25 +2782,43 @@
           <w:sz w:val="22"/>
           <w:szCs w:val="22"/>
         </w:rPr>
-        <w:t xml:space="preserve">Phát mật khẩu </w:t>
-      </w:r>
-      <w:r>
-        <w:rPr>
-          <w:rFonts w:ascii="Times New Roman" w:cs="Times New Roman" w:eastAsia="Times New Roman" w:hAnsi="Times New Roman"/>
-          <w:b/>
-          <w:bCs/>
-          <w:sz w:val="22"/>
-          <w:szCs w:val="22"/>
-        </w:rPr>
-        <w:t xml:space="preserve">riêng cho từng học sinh</w:t>
-      </w:r>
-      <w:r>
-        <w:rPr>
-          <w:rFonts w:ascii="Times New Roman" w:cs="Times New Roman" w:eastAsia="Times New Roman" w:hAnsi="Times New Roman"/>
-          <w:sz w:val="22"/>
-          <w:szCs w:val="22"/>
-        </w:rPr>
-        <w:t xml:space="preserve">, rồi xoá file sau khi phát xong</w:t>
+        <w:t xml:space="preserve">Thông báo cho học sinh: đăng nhập bằng </w:t>
+      </w:r>
+      <w:r>
+        <w:rPr>
+          <w:rFonts w:ascii="Times New Roman" w:cs="Times New Roman" w:eastAsia="Times New Roman" w:hAnsi="Times New Roman"/>
+          <w:b/>
+          <w:bCs/>
+          <w:sz w:val="22"/>
+          <w:szCs w:val="22"/>
+        </w:rPr>
+        <w:t xml:space="preserve">email của em</w:t>
+      </w:r>
+      <w:r>
+        <w:rPr>
+          <w:rFonts w:ascii="Times New Roman" w:cs="Times New Roman" w:eastAsia="Times New Roman" w:hAnsi="Times New Roman"/>
+          <w:sz w:val="22"/>
+          <w:szCs w:val="22"/>
+        </w:rPr>
+        <w:t xml:space="preserve"> và mật khẩu lần đầu </w:t>
+      </w:r>
+      <w:r>
+        <w:rPr>
+          <w:rFonts w:ascii="Times New Roman" w:cs="Times New Roman" w:eastAsia="Times New Roman" w:hAnsi="Times New Roman"/>
+          <w:b/>
+          <w:bCs/>
+          <w:sz w:val="22"/>
+          <w:szCs w:val="22"/>
+        </w:rPr>
+        <w:t xml:space="preserve">Okr@2026</w:t>
+      </w:r>
+      <w:r>
+        <w:rPr>
+          <w:rFonts w:ascii="Times New Roman" w:cs="Times New Roman" w:eastAsia="Times New Roman" w:hAnsi="Times New Roman"/>
+          <w:sz w:val="22"/>
+          <w:szCs w:val="22"/>
+        </w:rPr>
+        <w:t xml:space="preserve">, sau đó đổi mật khẩu riêng</w:t>
       </w:r>
     </w:p>
     <w:p>
@@ -2852,7 +2880,7 @@
                 <w:sz w:val="21"/>
                 <w:szCs w:val="21"/>
               </w:rPr>
-              <w:t xml:space="preserve">• Mỗi học sinh có một mật khẩu ngẫu nhiên riêng. Mật khẩu CHỈ hiển thị một lần trong file tải về, hệ thống không lưu và không xem lại được.</w:t>
+              <w:t xml:space="preserve">• Mọi học sinh mới đều có mật khẩu lần đầu là Okr@2026. Hệ thống BẮT BUỘC các em đổi sang mật khẩu riêng ngay ở lần đăng nhập đầu tiên.</w:t>
             </w:r>
           </w:p>
           <w:p>
@@ -2866,7 +2894,7 @@
                 <w:sz w:val="21"/>
                 <w:szCs w:val="21"/>
               </w:rPr>
-              <w:t xml:space="preserve">• Mất file mật khẩu: vào Danh sách học sinh, chọn học sinh, dùng chức năng cấp lại mật khẩu. Mật khẩu mới hiện trong một ô để sao chép.</w:t>
+              <w:t xml:space="preserve">• Vì mật khẩu lần đầu giống nhau, hãy nhắc học sinh đăng nhập và đổi mật khẩu càng sớm càng tốt sau khi được tạo tài khoản.</w:t>
             </w:r>
           </w:p>
           <w:p>
@@ -2880,7 +2908,7 @@
                 <w:sz w:val="21"/>
                 <w:szCs w:val="21"/>
               </w:rPr>
-              <w:t xml:space="preserve">• Email đã có trong hệ thống sẽ được bỏ qua và báo lại, không tạo trùng.</w:t>
+              <w:t xml:space="preserve">• Học sinh quên mật khẩu: vào Danh sách học sinh, chọn em đó, cấp lại mật khẩu. Mật khẩu mới là chuỗi ngẫu nhiên, hiện trong một ô để sao chép và chỉ hiện một lần.</w:t>
             </w:r>
           </w:p>
           <w:p>
@@ -2894,7 +2922,7 @@
                 <w:sz w:val="21"/>
                 <w:szCs w:val="21"/>
               </w:rPr>
-              <w:t xml:space="preserve">• Học sinh được nhập tự động vào đúng lớp thầy/cô phụ trách.</w:t>
+              <w:t xml:space="preserve">• Email đã có trong hệ thống sẽ được bỏ qua và báo lại, không tạo trùng. Học sinh được nhập tự động vào đúng lớp thầy/cô phụ trách.</w:t>
             </w:r>
           </w:p>
         </w:tc>
@@ -5022,25 +5050,25 @@
           <w:sz w:val="22"/>
           <w:szCs w:val="22"/>
         </w:rPr>
-        <w:t xml:space="preserve"> và </w:t>
-      </w:r>
-      <w:r>
-        <w:rPr>
-          <w:rFonts w:ascii="Times New Roman" w:cs="Times New Roman" w:eastAsia="Times New Roman" w:hAnsi="Times New Roman"/>
-          <w:b/>
-          <w:bCs/>
-          <w:sz w:val="22"/>
-          <w:szCs w:val="22"/>
-        </w:rPr>
-        <w:t xml:space="preserve">mật khẩu</w:t>
-      </w:r>
-      <w:r>
-        <w:rPr>
-          <w:rFonts w:ascii="Times New Roman" w:cs="Times New Roman" w:eastAsia="Times New Roman" w:hAnsi="Times New Roman"/>
-          <w:sz w:val="22"/>
-          <w:szCs w:val="22"/>
-        </w:rPr>
-        <w:t xml:space="preserve"> từ thầy cô chủ nhiệm</w:t>
+        <w:t xml:space="preserve"> từ thầy cô chủ nhiệm. Mật khẩu lần đầu là </w:t>
+      </w:r>
+      <w:r>
+        <w:rPr>
+          <w:rFonts w:ascii="Times New Roman" w:cs="Times New Roman" w:eastAsia="Times New Roman" w:hAnsi="Times New Roman"/>
+          <w:b/>
+          <w:bCs/>
+          <w:sz w:val="22"/>
+          <w:szCs w:val="22"/>
+        </w:rPr>
+        <w:t xml:space="preserve">Okr@2026</w:t>
+      </w:r>
+      <w:r>
+        <w:rPr>
+          <w:rFonts w:ascii="Times New Roman" w:cs="Times New Roman" w:eastAsia="Times New Roman" w:hAnsi="Times New Roman"/>
+          <w:sz w:val="22"/>
+          <w:szCs w:val="22"/>
+        </w:rPr>
+        <w:t xml:space="preserve"> (chữ O viết hoa)</w:t>
       </w:r>
     </w:p>
     <w:p>
@@ -5122,7 +5150,25 @@
           <w:sz w:val="22"/>
           <w:szCs w:val="22"/>
         </w:rPr>
-        <w:t xml:space="preserve">Nhập email và mật khẩu, gõ đúng chữ hoa chữ thường → bấm </w:t>
+        <w:t xml:space="preserve">Nhập email và mật khẩu </w:t>
+      </w:r>
+      <w:r>
+        <w:rPr>
+          <w:rFonts w:ascii="Times New Roman" w:cs="Times New Roman" w:eastAsia="Times New Roman" w:hAnsi="Times New Roman"/>
+          <w:b/>
+          <w:bCs/>
+          <w:sz w:val="22"/>
+          <w:szCs w:val="22"/>
+        </w:rPr>
+        <w:t xml:space="preserve">Okr@2026</w:t>
+      </w:r>
+      <w:r>
+        <w:rPr>
+          <w:rFonts w:ascii="Times New Roman" w:cs="Times New Roman" w:eastAsia="Times New Roman" w:hAnsi="Times New Roman"/>
+          <w:sz w:val="22"/>
+          <w:szCs w:val="22"/>
+        </w:rPr>
+        <w:t xml:space="preserve">, gõ đúng chữ hoa chữ thường → bấm </w:t>
       </w:r>
       <w:r>
         <w:rPr>

</xml_diff>